<commit_message>
Drafting: citation fix (add [11] LimpSquid provenance attribution, fix [8], [9] spacing, rebuild 29p PDF, 17/17 checks PASS)
</commit_message>
<xml_diff>
--- a/outputs/SPC_FullPaper_AnargyaArkanDhafyHamdani.docx
+++ b/outputs/SPC_FullPaper_AnargyaArkanDhafyHamdani.docx
@@ -469,7 +469,7 @@
           <w:rFonts w:ascii="Times New Roman" w:hAnsi="Times New Roman" w:cs="Times New Roman" w:eastAsia="Times New Roman"/>
           <w:sz w:val="24"/>
         </w:rPr>
-        <w:t xml:space="preserve">) tuas analog untuk memperluas rentang gerak fisik stik serta menghadirkan mekanisme </w:t>
+        <w:t xml:space="preserve">) tuas analog untuk meningkatkan resolusi kendali pada rentang gerak stik yang sama serta menghadirkan mekanisme </w:t>
       </w:r>
       <w:r>
         <w:rPr>
@@ -484,7 +484,7 @@
           <w:rFonts w:ascii="Times New Roman" w:hAnsi="Times New Roman" w:cs="Times New Roman" w:eastAsia="Times New Roman"/>
           <w:sz w:val="24"/>
         </w:rPr>
-        <w:t xml:space="preserve"> inheren sebagai pengunci posisi alami sendi tanpa kopling mekanis. Efektivitas perancangan dirumuskan melalui rencana protokol validasi pra-registrasi dengan desain faktorial 2×2 (mode kasar versus halus pada variasi jarak 1 m dan 3 m) yang direncanakan melibatkan tiga pasang operator untuk memindahkan balok uji busa sintetis 30 mm di atas kisi milimeter terkalibrasi. Seluruh parameter kinerja disajikan secara eksplisit sebagai target pra-registrasi dan analisis ekspektasi teknis demi mematuhi integritas akademik kompetisi, mencakup target latensi transmisi satu arah ≤ 200 ms, galat penempatan Euclidean dalam batas satu sel kisi target, serta penahanan posisi stabil selama 2 detik dengan tingkat keberhasilan minimal 80%. Sebagai pembuktian konsep skala meja, intervensi mode posisi-halus ini diharapkan mampu mereduksi galat penempatan serta variabilitas performa operator pada tugas penanganan presisi jarak jauh.</w:t>
+        <w:t xml:space="preserve"> inheren sebagai pengunci posisi alami sendi tanpa kopling mekanis. Efektivitas perancangan dirumuskan melalui rencana protokol validasi pra-registrasi dengan desain faktorial 2×2 (mode kasar versus halus pada variasi jarak 1 m dan 3 m) yang direncanakan melibatkan tiga operator berpasangan untuk memindahkan balok uji busa sintetis 30 mm di atas kisi milimeter terkalibrasi. Seluruh parameter kinerja disajikan secara eksplisit sebagai target pra-registrasi dan analisis ekspektasi teknis demi mematuhi integritas akademik kompetisi, mencakup target latensi transmisi satu arah ≤ 200 ms, galat penempatan Euclidean dalam batas satu sel kisi target, serta penahanan posisi stabil selama 2 detik dengan tingkat keberhasilan minimal 80%. Sebagai pembuktian konsep skala meja, intervensi mode posisi-halus ini diharapkan mampu mereduksi galat penempatan serta variabilitas performa operator pada tugas penanganan presisi jarak jauh.</w:t>
       </w:r>
     </w:p>
     <w:p>
@@ -571,7 +571,7 @@
           <w:rFonts w:ascii="Times New Roman" w:hAnsi="Times New Roman" w:cs="Times New Roman" w:eastAsia="Times New Roman"/>
           <w:sz w:val="24"/>
         </w:rPr>
-        <w:t xml:space="preserve">Perpindahan itu melahirkan masalah yang menjadi fokus penelitian ini: akurasi penempatan. Ketika lengan dikendalikan dari jarak jauh, ketepatan berhenti di atas sasaran tidak lagi ditentukan oleh tangan operator melainkan oleh cara perintah operator diterjemahkan menjadi gerakan sendi. Kehilangan presisi saat penempatan pada penanganan bahan radioaktif berisiko pada bahan yang ditangani maupun pada lingkungan sekitarnya, sehingga akurasi penempatan menjadi syarat kerja, bukan nilai tambah. </w:t>
+        <w:t xml:space="preserve">Perpindahan itu melahirkan masalah yang menjadi fokus penelitian ini: akurasi penempatan. Ketika lengan dikendalikan dari jarak jauh, akurasi tetap ditentukan oleh mutu penanganan operator; yang berubah adalah jalurnya, karena mutu itu kini melewati penerjemahan perintah operator menjadi gerakan sendi. Kehilangan presisi saat penempatan menjadikan akurasi penempatan syarat kerja pada penanganan bahan radioaktif, bukan nilai tambah, dan penerjemahan perintah itulah yang menjadi titik intervensi rancangan ini. </w:t>
       </w:r>
       <w:r>
         <w:rPr>
@@ -586,7 +586,7 @@
           <w:rFonts w:ascii="Times New Roman" w:hAnsi="Times New Roman" w:cs="Times New Roman" w:eastAsia="Times New Roman"/>
           <w:sz w:val="24"/>
         </w:rPr>
-        <w:t>; latar akurasi dan penanganan ini dipertahankan tanpa perubahan dari rumusan semula.</w:t>
+        <w:t>; latar akurasi dan penanganan pada bagian ini dipertahankan dari rumusan semula, sedangkan perubahan rancangan dijelaskan pada bab Metodologi.</w:t>
       </w:r>
     </w:p>
     <w:p>
@@ -727,21 +727,7 @@
           <w:rFonts w:ascii="Times New Roman" w:hAnsi="Times New Roman" w:cs="Times New Roman" w:eastAsia="Times New Roman"/>
           <w:sz w:val="24"/>
         </w:rPr>
-        <w:t xml:space="preserve">Bagian ini menyusun landasan yang dipakai solusi, bukan survei. Tiga hal yang harus dijawabnya: mengapa penempatan presisi sulit pada teleoperasi, apa yang sudah dibuktikan literatur tentang penskalaan gerak dan kendali hibrida posisi–laju, dan dasar fisika yang menghubungkan jarak dengan latensi. Setiap klaim luar pada bagian ini dipetakan ke satu entri di </w:t>
-      </w:r>
-      <w:r>
-        <w:rPr>
-          <w:rFonts w:ascii="Courier New" w:hAnsi="Courier New" w:cs="Courier New" w:eastAsia="Courier New"/>
-          <w:sz w:val="24"/>
-        </w:rPr>
-        <w:t>claim-ledger.md</w:t>
-      </w:r>
-      <w:r>
-        <w:rPr>
-          <w:rFonts w:ascii="Times New Roman" w:hAnsi="Times New Roman" w:cs="Times New Roman" w:eastAsia="Times New Roman"/>
-          <w:sz w:val="24"/>
-        </w:rPr>
-        <w:t>; tidak ada angka yang masuk tanpa sumber atau tanpa label target pra-registrasi.</w:t>
+        <w:t>Bagian ini menyusun landasan yang dipakai solusi, bukan survei. Tiga hal yang harus dijawabnya: mengapa penempatan presisi sulit pada teleoperasi, apa yang sudah dibuktikan literatur tentang penskalaan gerak dan kendali hibrida posisi–laju, dan dasar fisika yang menghubungkan jarak dengan latensi. Setiap klaim luar pada bagian ini menyertakan sumbernya; tidak ada angka yang masuk tanpa sumber atau tanpa label target pra-registrasi.</w:t>
       </w:r>
     </w:p>
     <w:p>
@@ -1475,21 +1461,7 @@
           <w:rFonts w:ascii="Times New Roman" w:hAnsi="Times New Roman" w:cs="Times New Roman" w:eastAsia="Times New Roman"/>
           <w:sz w:val="24"/>
         </w:rPr>
-        <w:t xml:space="preserve">Bab ini menguraikan metodologi perancangan dan validasi sistem teleoperasi lengan robot 5-DOF. Pemaparan dibagi menjadi tiga bagian utama: (i) arsitektur sistem kendali teleoperasi dari pengirim hingga aktuator, (ii) spesifikasi intervensi kendali mode posisi-halus dan penguncian posisi saat tuas netral, serta (iii) protokol eksperimen validasi 2×2 yang dirancang sebagai rencana pengujian pra-registrasi. Seluruh variabel, target kuantitatif, dan batas kriteria pada bab ini dipetakan secara ketat ke dokumen </w:t>
-      </w:r>
-      <w:r>
-        <w:rPr>
-          <w:rFonts w:ascii="Courier New" w:hAnsi="Courier New" w:cs="Courier New" w:eastAsia="Courier New"/>
-          <w:sz w:val="24"/>
-        </w:rPr>
-        <w:t>claim-ledger.md</w:t>
-      </w:r>
-      <w:r>
-        <w:rPr>
-          <w:rFonts w:ascii="Times New Roman" w:hAnsi="Times New Roman" w:cs="Times New Roman" w:eastAsia="Times New Roman"/>
-          <w:sz w:val="24"/>
-        </w:rPr>
-        <w:t>.</w:t>
+        <w:t>Bab ini menguraikan metodologi perancangan dan validasi sistem teleoperasi lengan robot 5-DOF. Pemaparan dibagi menjadi tiga bagian utama: (i) arsitektur sistem kendali teleoperasi dari pengirim hingga aktuator, (ii) spesifikasi intervensi kendali mode posisi-halus dan penguncian posisi saat tuas netral, serta (iii) protokol eksperimen validasi 2×2 yang dirancang sebagai rencana pengujian pra-registrasi. Seluruh variabel, target kuantitatif, dan batas kriteria pada bab ini dinyatakan sebagai target pra-registrasi tim, bukan angka hasil pengukuran.</w:t>
       </w:r>
     </w:p>
     <w:p>
@@ -2275,7 +2247,7 @@
           <w:rFonts w:ascii="Times New Roman" w:hAnsi="Times New Roman" w:cs="Times New Roman" w:eastAsia="Times New Roman"/>
           <w:sz w:val="24"/>
         </w:rPr>
-        <w:t>), simpangan fisik tuas stik yang sama akan menghasilkan perubahan sudut sendi yang jauh lebih kecil. Penurunan rasio gerak ini memberikan resolusi spasial yang lebih tinggi bagi operator untuk melakukan penyesuaian akhir di atas area sasaran, merujuk pada prinsip penskalaan gerak yang terbukti mereduksi galat penempatan pada studi teleoperasi terdahulu.[4],[3]</w:t>
+        <w:t>), simpangan fisik tuas stik yang sama akan menghasilkan perubahan sudut sendi yang jauh lebih kecil. Penurunan rasio gerak ini memberikan resolusi spasial yang lebih tinggi bagi operator untuk melakukan penyesuaian akhir di atas area sasaran, merujuk pada prinsip penskalaan gerak yang terbukti mereduksi galat penempatan pada studi teleoperasi terdahulu [3], [4].</w:t>
       </w:r>
     </w:p>
     <w:p>
@@ -2368,7 +2340,7 @@
           <w:rFonts w:ascii="Times New Roman" w:hAnsi="Times New Roman" w:cs="Times New Roman" w:eastAsia="Times New Roman"/>
           <w:sz w:val="24"/>
         </w:rPr>
-        <w:t xml:space="preserve"> menahan nilai sudut acuan terakhir (θ_ref = θ_terakhir) dan mengunci keluaran register PWM pada sudut tersebut. Manipulator berhenti seketika di posisi terakhir tanpa mengalami pergeseran (</w:t>
+        <w:t xml:space="preserve"> menahan nilai sudut acuan terakhir (θ_ref = θ_terakhir) dan mengunci keluaran register PWM pada sudut tersebut. Manipulator dirancang berhenti pada posisi terakhir tanpa memerlukan mekanisme tambahan; ada tidaknya pergeseran (</w:t>
       </w:r>
       <w:r>
         <w:rPr>
@@ -2383,7 +2355,7 @@
           <w:rFonts w:ascii="Times New Roman" w:hAnsi="Times New Roman" w:cs="Times New Roman" w:eastAsia="Times New Roman"/>
           <w:sz w:val="24"/>
         </w:rPr>
-        <w:t xml:space="preserve">). Dalam penelitian ini, perilaku perangkat lunak </w:t>
+        <w:t xml:space="preserve">) diukur pada tahap Final. Dalam penelitian ini, perilaku perangkat lunak </w:t>
       </w:r>
       <w:r>
         <w:rPr>
@@ -2821,7 +2793,7 @@
           <w:rFonts w:ascii="Times New Roman" w:hAnsi="Times New Roman" w:cs="Times New Roman" w:eastAsia="Times New Roman"/>
           <w:sz w:val="24"/>
         </w:rPr>
-        <w:t>Pemilihan jarak 1 meter dan 3 meter didasarkan pada landasan fisika propagasi gelombang elektromagnetik dalam ruangan: daya sinyal nirkabel berkurang secara logaritmik terhadap jarak dan meningkatkan sebaran latensi komunikasi.[8],[9]</w:t>
+        <w:t>Pemilihan jarak 1 meter dan 3 meter didasarkan pada landasan fisika propagasi gelombang elektromagnetik dalam ruangan: daya sinyal nirkabel berkurang secara logaritmik terhadap jarak dan meningkatkan sebaran latensi komunikasi.[8], [9]</w:t>
       </w:r>
     </w:p>
     <w:p>
@@ -3007,7 +2979,7 @@
           <w:rFonts w:ascii="Times New Roman" w:hAnsi="Times New Roman" w:cs="Times New Roman" w:eastAsia="Times New Roman"/>
           <w:sz w:val="24"/>
         </w:rPr>
-        <w:t>Tugas eksperimental yang dilakukan adalah memindahkan balok busa berdensitas seragam (ukuran 30 mm × 30 mm × 30 mm, massa ±15 gram) dari titik awal tetap menuju zona target pada papan kisi koordinat berjarak milimeter.</w:t>
+        <w:t>Tugas eksperimental yang dilakukan adalah memindahkan balok busa berdensitas seragam (ukuran 30 mm × 30 mm × 30 mm, massa ±15 gram — spesifikasi desain yang ditetapkan saat perakitan) dari titik awal tetap menuju zona target pada papan kisi koordinat berjarak milimeter.</w:t>
       </w:r>
     </w:p>
     <w:p>
@@ -3131,7 +3103,7 @@
           <w:rFonts w:ascii="Times New Roman" w:hAnsi="Times New Roman" w:cs="Times New Roman" w:eastAsia="Times New Roman"/>
           <w:sz w:val="24"/>
         </w:rPr>
-        <w:t xml:space="preserve"> pada setiap sesi pengujian. Kriteria ini merupakan metrik keberhasilan yang dirumuskan secara internal oleh proyek (</w:t>
+        <w:t xml:space="preserve"> pada setiap blok 10 percobaan. Setiap sel pengujian terdiri atas empat blok (40 percobaan), sehingga satu sel dinyatakan lulus bila sekurang-kurangnya 32 dari 40 percobaan (80%) berhasil. Kriteria ini merupakan metrik keberhasilan yang dirumuskan secara internal oleh proyek (</w:t>
       </w:r>
       <w:r>
         <w:rPr>
@@ -3629,7 +3601,7 @@
           <w:rFonts w:ascii="Times New Roman" w:hAnsi="Times New Roman" w:cs="Times New Roman" w:eastAsia="Times New Roman"/>
           <w:sz w:val="24"/>
         </w:rPr>
-        <w:t>) terhadap papan kisi terkalibrasi, kemudian dianalisis terhadap garis acuan kisi berketelitian 0,5 mm. Target performa pra-registrasi yang dipatok adalah galat penempatan akhir berada di dalam batas toleransi satu sel kisi uji.</w:t>
+        <w:t>) terhadap papan kisi terkalibrasi, kemudian dianalisis terhadap garis acuan kisi berketelitian 0,5 mm (spesifikasi instrumen yang ditetapkan saat perakitan). Target performa pra-registrasi yang dipatok adalah galat penempatan akhir berada di dalam batas toleransi satu sel kisi uji.</w:t>
       </w:r>
     </w:p>
     <w:p>
@@ -4248,7 +4220,7 @@
         </w:trPr>
         <w:tc>
           <w:tcPr>
-            <w:tcW w:type="dxa" w:w="1703"/>
+            <w:tcW w:type="dxa" w:w="1705"/>
             <w:tcBorders>
               <w:bottom w:val="single" w:sz="6" w:space="0" w:color="000000"/>
             </w:tcBorders>
@@ -4277,7 +4249,7 @@
         </w:tc>
         <w:tc>
           <w:tcPr>
-            <w:tcW w:type="dxa" w:w="1598"/>
+            <w:tcW w:type="dxa" w:w="1599"/>
             <w:tcBorders>
               <w:bottom w:val="single" w:sz="6" w:space="0" w:color="000000"/>
             </w:tcBorders>
@@ -4306,7 +4278,7 @@
         </w:tc>
         <w:tc>
           <w:tcPr>
-            <w:tcW w:type="dxa" w:w="1725"/>
+            <w:tcW w:type="dxa" w:w="1727"/>
             <w:tcBorders>
               <w:bottom w:val="single" w:sz="6" w:space="0" w:color="000000"/>
             </w:tcBorders>
@@ -4335,7 +4307,7 @@
         </w:tc>
         <w:tc>
           <w:tcPr>
-            <w:tcW w:type="dxa" w:w="2134"/>
+            <w:tcW w:type="dxa" w:w="2125"/>
             <w:tcBorders>
               <w:bottom w:val="single" w:sz="6" w:space="0" w:color="000000"/>
             </w:tcBorders>
@@ -4364,7 +4336,7 @@
         </w:tc>
         <w:tc>
           <w:tcPr>
-            <w:tcW w:type="dxa" w:w="1866"/>
+            <w:tcW w:type="dxa" w:w="1869"/>
             <w:tcBorders>
               <w:bottom w:val="single" w:sz="6" w:space="0" w:color="000000"/>
             </w:tcBorders>
@@ -4398,7 +4370,7 @@
         </w:trPr>
         <w:tc>
           <w:tcPr>
-            <w:tcW w:type="dxa" w:w="1703"/>
+            <w:tcW w:type="dxa" w:w="1705"/>
           </w:tcPr>
           <w:p>
             <w:pPr>
@@ -4434,7 +4406,7 @@
         </w:tc>
         <w:tc>
           <w:tcPr>
-            <w:tcW w:type="dxa" w:w="1598"/>
+            <w:tcW w:type="dxa" w:w="1599"/>
           </w:tcPr>
           <w:p>
             <w:pPr>
@@ -4455,7 +4427,7 @@
         </w:tc>
         <w:tc>
           <w:tcPr>
-            <w:tcW w:type="dxa" w:w="1725"/>
+            <w:tcW w:type="dxa" w:w="1727"/>
           </w:tcPr>
           <w:p>
             <w:pPr>
@@ -4476,7 +4448,7 @@
         </w:tc>
         <w:tc>
           <w:tcPr>
-            <w:tcW w:type="dxa" w:w="2134"/>
+            <w:tcW w:type="dxa" w:w="2125"/>
           </w:tcPr>
           <w:p>
             <w:pPr>
@@ -4491,13 +4463,13 @@
                 <w:rFonts w:ascii="Times New Roman" w:hAnsi="Times New Roman" w:cs="Times New Roman" w:eastAsia="Times New Roman"/>
                 <w:sz w:val="18"/>
               </w:rPr>
-              <w:t>Ambang batas persepsi kendali semi-real-time operator; mengantisipasi variabilitas propagasi dalam ruangan (Akl et al. 2006 [8]; Pandey &amp; Parasuraman 2021 [9])</w:t>
-            </w:r>
-          </w:p>
-        </w:tc>
-        <w:tc>
-          <w:tcPr>
-            <w:tcW w:type="dxa" w:w="1866"/>
+              <w:t>Batas desain yang ditetapkan tim, bukan angka literatur; [8] dan [9] menjadi dasar mengapa sebaran latensi, bukan hanya rata-ratanya, harus dilaporkan</w:t>
+            </w:r>
+          </w:p>
+        </w:tc>
+        <w:tc>
+          <w:tcPr>
+            <w:tcW w:type="dxa" w:w="1869"/>
           </w:tcPr>
           <w:p>
             <w:pPr>
@@ -4553,7 +4525,7 @@
         </w:trPr>
         <w:tc>
           <w:tcPr>
-            <w:tcW w:type="dxa" w:w="1703"/>
+            <w:tcW w:type="dxa" w:w="1705"/>
           </w:tcPr>
           <w:p>
             <w:pPr>
@@ -4604,7 +4576,7 @@
         </w:tc>
         <w:tc>
           <w:tcPr>
-            <w:tcW w:type="dxa" w:w="1598"/>
+            <w:tcW w:type="dxa" w:w="1599"/>
           </w:tcPr>
           <w:p>
             <w:pPr>
@@ -4625,7 +4597,7 @@
         </w:tc>
         <w:tc>
           <w:tcPr>
-            <w:tcW w:type="dxa" w:w="1725"/>
+            <w:tcW w:type="dxa" w:w="1727"/>
           </w:tcPr>
           <w:p>
             <w:pPr>
@@ -4661,7 +4633,7 @@
         </w:tc>
         <w:tc>
           <w:tcPr>
-            <w:tcW w:type="dxa" w:w="2134"/>
+            <w:tcW w:type="dxa" w:w="2125"/>
           </w:tcPr>
           <w:p>
             <w:pPr>
@@ -4676,13 +4648,13 @@
                 <w:rFonts w:ascii="Times New Roman" w:hAnsi="Times New Roman" w:cs="Times New Roman" w:eastAsia="Times New Roman"/>
                 <w:sz w:val="18"/>
               </w:rPr>
-              <w:t>Resolusi kendali sudut mikro via modulasi PWM 12-bit PCA9685 dan penskalaan gerak halus (Richter et al. 2019 [4]; Han &amp; Yang 2022 [3])</w:t>
-            </w:r>
-          </w:p>
-        </w:tc>
-        <w:tc>
-          <w:tcPr>
-            <w:tcW w:type="dxa" w:w="1866"/>
+              <w:t>Resolusi kendali sudut mikro via modulasi PWM 12-bit PCA9685 dan penskalaan gerak halus ([3], [4])</w:t>
+            </w:r>
+          </w:p>
+        </w:tc>
+        <w:tc>
+          <w:tcPr>
+            <w:tcW w:type="dxa" w:w="1869"/>
           </w:tcPr>
           <w:p>
             <w:pPr>
@@ -4708,7 +4680,7 @@
         </w:trPr>
         <w:tc>
           <w:tcPr>
-            <w:tcW w:type="dxa" w:w="1703"/>
+            <w:tcW w:type="dxa" w:w="1705"/>
           </w:tcPr>
           <w:p>
             <w:pPr>
@@ -4744,7 +4716,7 @@
         </w:tc>
         <w:tc>
           <w:tcPr>
-            <w:tcW w:type="dxa" w:w="1598"/>
+            <w:tcW w:type="dxa" w:w="1599"/>
           </w:tcPr>
           <w:p>
             <w:pPr>
@@ -4765,7 +4737,7 @@
         </w:tc>
         <w:tc>
           <w:tcPr>
-            <w:tcW w:type="dxa" w:w="1725"/>
+            <w:tcW w:type="dxa" w:w="1727"/>
           </w:tcPr>
           <w:p>
             <w:pPr>
@@ -4786,7 +4758,7 @@
         </w:tc>
         <w:tc>
           <w:tcPr>
-            <w:tcW w:type="dxa" w:w="2134"/>
+            <w:tcW w:type="dxa" w:w="2125"/>
           </w:tcPr>
           <w:p>
             <w:pPr>
@@ -4822,7 +4794,7 @@
         </w:tc>
         <w:tc>
           <w:tcPr>
-            <w:tcW w:type="dxa" w:w="1866"/>
+            <w:tcW w:type="dxa" w:w="1869"/>
           </w:tcPr>
           <w:p>
             <w:pPr>
@@ -4863,7 +4835,7 @@
         </w:trPr>
         <w:tc>
           <w:tcPr>
-            <w:tcW w:type="dxa" w:w="1703"/>
+            <w:tcW w:type="dxa" w:w="1705"/>
           </w:tcPr>
           <w:p>
             <w:pPr>
@@ -4884,7 +4856,7 @@
         </w:tc>
         <w:tc>
           <w:tcPr>
-            <w:tcW w:type="dxa" w:w="1598"/>
+            <w:tcW w:type="dxa" w:w="1599"/>
           </w:tcPr>
           <w:p>
             <w:pPr>
@@ -4905,7 +4877,7 @@
         </w:tc>
         <w:tc>
           <w:tcPr>
-            <w:tcW w:type="dxa" w:w="1725"/>
+            <w:tcW w:type="dxa" w:w="1727"/>
           </w:tcPr>
           <w:p>
             <w:pPr>
@@ -4986,7 +4958,7 @@
         </w:tc>
         <w:tc>
           <w:tcPr>
-            <w:tcW w:type="dxa" w:w="2134"/>
+            <w:tcW w:type="dxa" w:w="2125"/>
           </w:tcPr>
           <w:p>
             <w:pPr>
@@ -5022,7 +4994,7 @@
         </w:tc>
         <w:tc>
           <w:tcPr>
-            <w:tcW w:type="dxa" w:w="1866"/>
+            <w:tcW w:type="dxa" w:w="1869"/>
           </w:tcPr>
           <w:p>
             <w:pPr>
@@ -5067,36 +5039,7 @@
           <w:rFonts w:ascii="Times New Roman" w:hAnsi="Times New Roman" w:cs="Times New Roman" w:eastAsia="Times New Roman"/>
           <w:sz w:val="24"/>
         </w:rPr>
-        <w:t xml:space="preserve">Penetapan target latensi ≤ 200 ms dan galat penempatan dalam batas satu sel kisi target merupakan target internal tim yang didasarkan pada batasan arsitektur perangkat keras dan kajian teleoperasi yang telah didokumentasikan dalam </w:t>
-      </w:r>
-      <w:r>
-        <w:rPr>
-          <w:rFonts w:ascii="Times New Roman" w:hAnsi="Times New Roman" w:cs="Times New Roman" w:eastAsia="Times New Roman"/>
-          <w:i/>
-          <w:sz w:val="24"/>
-        </w:rPr>
-        <w:t>claim ledger</w:t>
-      </w:r>
-      <w:r>
-        <w:rPr>
-          <w:rFonts w:ascii="Times New Roman" w:hAnsi="Times New Roman" w:cs="Times New Roman" w:eastAsia="Times New Roman"/>
-          <w:sz w:val="24"/>
-        </w:rPr>
-        <w:t xml:space="preserve"> proyek (</w:t>
-      </w:r>
-      <w:r>
-        <w:rPr>
-          <w:rFonts w:ascii="Courier New" w:hAnsi="Courier New" w:cs="Courier New" w:eastAsia="Courier New"/>
-          <w:sz w:val="24"/>
-        </w:rPr>
-        <w:t>claim-ledger.md</w:t>
-      </w:r>
-      <w:r>
-        <w:rPr>
-          <w:rFonts w:ascii="Times New Roman" w:hAnsi="Times New Roman" w:cs="Times New Roman" w:eastAsia="Times New Roman"/>
-          <w:sz w:val="24"/>
-        </w:rPr>
-        <w:t>).</w:t>
+        <w:t>Penetapan target latensi ≤ 200 ms dan galat penempatan dalam batas satu sel kisi target merupakan target internal tim yang didasarkan pada batasan arsitektur perangkat keras dan kajian teleoperasi yang telah disinggung pada bab Dasar Teori.</w:t>
       </w:r>
     </w:p>
     <w:p>
@@ -5192,7 +5135,7 @@
           <w:rFonts w:ascii="Times New Roman" w:hAnsi="Times New Roman" w:cs="Times New Roman" w:eastAsia="Times New Roman"/>
           <w:sz w:val="24"/>
         </w:rPr>
-        <w:t>) saat capit berada beberapa milimeter di atas sasaran, defleksi jempol operator sebesar pecahan milimeter menghasilkan kecepatan sudut sendi yang relatif kasar. Upaya operator untuk melakukan koreksi posisi mikro kerap kali menghasilkan koreksi berlebih (</w:t>
+        <w:t>) saat capit berada beberapa milimeter di atas sasaran, defleksi jempol operator — pada orde pecahan milimeter, sesuai asumsi desain — menghasilkan kecepatan sudut sendi yang relatif kasar. Upaya operator untuk melakukan koreksi posisi mikro kerap kali menghasilkan koreksi berlebih (</w:t>
       </w:r>
       <w:r>
         <w:rPr>
@@ -5313,7 +5256,7 @@
           <w:rFonts w:ascii="Times New Roman" w:hAnsi="Times New Roman" w:cs="Times New Roman" w:eastAsia="Times New Roman"/>
           <w:sz w:val="24"/>
         </w:rPr>
-        <w:t>). Hal ini memperluas rentang toleransi kinestetik tangan operator, memungkinkan pergerakan mikro berkecepatan rendah yang stabil di dekat sasaran. Prinsip penskalaan gerak ini konsisten dengan literatur teleoperasi bedah mikro (Richter et al. 2019 [4]) dan teleoperasi penanganan bahan nuklir (Han &amp; Yang 2022 [3]), di mana penskalaan gerak terbukti menurunkan tingkat galat operator secara terukur.</w:t>
+        <w:t>). Hal ini memperluas rentang toleransi kinestetik tangan operator, memungkinkan pergerakan mikro berkecepatan rendah yang stabil di dekat sasaran. Prinsip penskalaan gerak ini konsisten dengan literatur teleoperasi bedah mikro [4] dan teleoperasi penanganan bahan nuklir [3]; pada kedua studi tersebut penskalaan gerak terbukti menurunkan tingkat galat operator secara terukur.</w:t>
       </w:r>
     </w:p>
     <w:p>
@@ -5498,7 +5441,7 @@
           <w:rFonts w:ascii="Times New Roman" w:hAnsi="Times New Roman" w:cs="Times New Roman" w:eastAsia="Times New Roman"/>
           <w:sz w:val="24"/>
         </w:rPr>
-        <w:t xml:space="preserve"> Berdasarkan model rugi propagasi dalam ruangan Akl, Tummala, dan Li (2006) [8], daya sinyal rata-rata yang diterima menurun secara logaritmik terhadap jarak (</w:t>
+        <w:t xml:space="preserve"> Berdasarkan model rugi propagasi dalam ruangan [8] [8], daya sinyal rata-rata yang diterima menurun secara logaritmik terhadap jarak (</w:t>
       </w:r>
       <w:r>
         <w:rPr>
@@ -5574,7 +5517,7 @@
           <w:rFonts w:ascii="Times New Roman" w:hAnsi="Times New Roman" w:cs="Times New Roman" w:eastAsia="Times New Roman"/>
           <w:sz w:val="24"/>
         </w:rPr>
-        <w:t xml:space="preserve"> Sebagaimana dilaporkan oleh Pandey dan Parasuraman (2021) [9] dalam studi empiris teleoperasi robot bergerak melalui Wi-Fi 2,4 GHz, delay transmisi memiliki variabilitas yang tinggi, di mana nilai simpangan baku delay kerap kali setara atau bahkan melampaui nilai rata-ratanya akibat interferensi kanal nirkabel dan </w:t>
+        <w:t xml:space="preserve"> Sebagaimana dilaporkan pada [9] dalam studi empiris teleoperasi robot bergerak melalui Wi-Fi 2,4 GHz, delay transmisi memiliki variabilitas yang tinggi, dengan nilai simpangan baku delay kerap kali setara atau bahkan melampaui nilai rata-ratanya akibat interferensi kanal nirkabel dan </w:t>
       </w:r>
       <w:r>
         <w:rPr>
@@ -5715,7 +5658,7 @@
           <w:rFonts w:ascii="Times New Roman" w:hAnsi="Times New Roman" w:cs="Times New Roman" w:eastAsia="Times New Roman"/>
           <w:sz w:val="24"/>
         </w:rPr>
-        <w:t>). Penanganan bahan bakar nuklir bekas riil pada fasilitas nuklir beroperasi di bawah kondisi ekstrem yang sangat berbeda dari lingkungan laboratorium skala meja, sebagaimana dipaparkan dalam dokumen teknis IAEA-TECDOC-1433 [1] dan IAEA Radiation [2]:</w:t>
+        <w:t>). Penanganan bahan bakar nuklir bekas riil pada fasilitas nuklir beroperasi di bawah kondisi ekstrem yang sangat berbeda dari lingkungan laboratorium skala meja, sebagaimana dipaparkan dalam dokumen teknis IAEA-TECDOC-1433 [2] dan IAEA Radiation [1]:</w:t>
       </w:r>
     </w:p>
     <w:p>
@@ -6116,7 +6059,7 @@
           <w:rFonts w:ascii="Times New Roman" w:hAnsi="Times New Roman" w:cs="Times New Roman" w:eastAsia="Times New Roman"/>
           <w:sz w:val="24"/>
         </w:rPr>
-        <w:t>Pilihan ini diambil secara sadar untuk menegakkan standar etika penelitian yang tinggi dan mematuhi aturan Buku Panduan SPC Eureka! ITB 2026 hal. 5 butir 7, di mana tindakan manipulasi hasil atau fabrikasi data berakibat pada sanksi pengurangan nilai atau diskualifikasi langsung. Protokol validasi 2×2 dengan alokasi 40 percobaan per kondisi per operator dirancang secara ketat sebagai instrumen pengujian objektif yang siap dijalankan dan didokumentasikan secara transparan pada tahap Final mendatang (Buku Panduan hal. 4 dan 13).</w:t>
+        <w:t>Pilihan ini diambil secara sadar untuk menegakkan standar etika penelitian yang tinggi dan mematuhi aturan Buku Panduan SPC Eureka! ITB 2026 hal. 5 butir 7: tindakan manipulasi hasil atau fabrikasi data berakibat pada sanksi pengurangan nilai atau diskualifikasi langsung. Protokol validasi 2×2 dengan alokasi 40 percobaan per kondisi per operator dirancang secara ketat sebagai instrumen pengujian objektif yang siap dijalankan dan didokumentasikan secara transparan pada tahap Final mendatang (Buku Panduan hal. 4 dan 13).</w:t>
       </w:r>
     </w:p>
     <w:p>
@@ -6258,7 +6201,7 @@
           <w:rFonts w:ascii="Times New Roman" w:hAnsi="Times New Roman" w:cs="Times New Roman" w:eastAsia="Times New Roman"/>
           <w:sz w:val="24"/>
         </w:rPr>
-        <w:t>), rentang gerak fisik tuas stik diperluas, sehingga secara efektif memitigasi fenomena osilasi koreksi berlebih (</w:t>
+        <w:t>), resolusi kendali pada rentang gerak stik yang sama meningkat, sehingga diharapkan memitigasi fenomena osilasi koreksi berlebih (</w:t>
       </w:r>
       <w:r>
         <w:rPr>
@@ -6349,7 +6292,7 @@
           <w:rFonts w:ascii="Times New Roman" w:hAnsi="Times New Roman" w:cs="Times New Roman" w:eastAsia="Times New Roman"/>
           <w:sz w:val="24"/>
         </w:rPr>
-        <w:t xml:space="preserve"> secara inheren di mana pemulangan tuas ke posisi netral secara otomatis menghasilkan kecepatan sudut nol dan mempertahankan sudut sendi terakhir pada register PWM PCA9685. Fitur perangkat lunak ini berfungsi sebagai pengunci posisi alami yang menggantikan kebutuhan mekanisme kopling fisik (</w:t>
+        <w:t xml:space="preserve"> secara inheren: pemulangan tuas ke posisi netral secara otomatis menghasilkan kecepatan sudut nol dan mempertahankan sudut sendi terakhir pada register PWM PCA9685. Fitur perangkat lunak ini berfungsi sebagai pengunci posisi alami yang menggantikan kebutuhan mekanisme kopling fisik (</w:t>
       </w:r>
       <w:r>
         <w:rPr>
@@ -6559,7 +6502,7 @@
           <w:i/>
           <w:sz w:val="24"/>
         </w:rPr>
-        <w:t>Eksplorasi otonomi pencekeraman berbasis visi komputer (ADR 0001):</w:t>
+        <w:t>Eksplorasi otonomi pencekeraman berbasis visi komputer:</w:t>
       </w:r>
       <w:r>
         <w:rPr>
@@ -6581,7 +6524,7 @@
           <w:rFonts w:ascii="Times New Roman" w:hAnsi="Times New Roman" w:cs="Times New Roman" w:eastAsia="Times New Roman"/>
           <w:sz w:val="24"/>
         </w:rPr>
-        <w:t xml:space="preserve">). Sebagaimana ditetapkan dalam keputusan arsitektur proyek (ADR 0001), integrasi modul kamera dan komputasi cerdas deteksi objek tidak dimasukkan ke dalam ruang lingkup dokumen </w:t>
+        <w:t xml:space="preserve">). Oleh karena itu integrasi modul kamera dan komputasi cerdas deteksi objek tidak dimasukkan ke dalam ruang lingkup dokumen </w:t>
       </w:r>
       <w:r>
         <w:rPr>
@@ -6881,6 +6824,67 @@
           <w:sz w:val="24"/>
         </w:rPr>
         <w:t>[10] B. Porter, "Arduino-PS2X: Playstation 2 controller library for Arduino," repositori kode sumber madsci1016/Arduino-PS2X (diportasi untuk ESP32 oleh MyArduinoLib/Arduino-PS2X-ESP32, 2020). [Daring]. Tersedia: https://github.com/madsci1016/Arduino-PS2X</w:t>
+      </w:r>
+    </w:p>
+    <w:p>
+      <w:pPr>
+        <w:keepNext w:val="0"/>
+        <w:widowControl/>
+        <w:spacing w:before="0" w:after="120" w:line="276" w:lineRule="auto"/>
+        <w:ind w:left="510" w:hanging="510"/>
+        <w:jc w:val="left"/>
+      </w:pPr>
+      <w:r>
+        <w:rPr>
+          <w:rFonts w:ascii="Times New Roman" w:hAnsi="Times New Roman" w:cs="Times New Roman" w:eastAsia="Times New Roman"/>
+          <w:sz w:val="24"/>
+        </w:rPr>
+        <w:t xml:space="preserve">[11] LimpSquid, "Robotic arm" (seri cetak 3D: bagian 1/3 </w:t>
+      </w:r>
+      <w:r>
+        <w:rPr>
+          <w:rFonts w:ascii="Times New Roman" w:hAnsi="Times New Roman" w:cs="Times New Roman" w:eastAsia="Times New Roman"/>
+          <w:i/>
+          <w:sz w:val="24"/>
+        </w:rPr>
+        <w:t>gripper</w:t>
+      </w:r>
+      <w:r>
+        <w:rPr>
+          <w:rFonts w:ascii="Times New Roman" w:hAnsi="Times New Roman" w:cs="Times New Roman" w:eastAsia="Times New Roman"/>
+          <w:sz w:val="24"/>
+        </w:rPr>
+        <w:t xml:space="preserve">, thing:1748596; bagian 2/3 </w:t>
+      </w:r>
+      <w:r>
+        <w:rPr>
+          <w:rFonts w:ascii="Times New Roman" w:hAnsi="Times New Roman" w:cs="Times New Roman" w:eastAsia="Times New Roman"/>
+          <w:i/>
+          <w:sz w:val="24"/>
+        </w:rPr>
+        <w:t>turntable</w:t>
+      </w:r>
+      <w:r>
+        <w:rPr>
+          <w:rFonts w:ascii="Times New Roman" w:hAnsi="Times New Roman" w:cs="Times New Roman" w:eastAsia="Times New Roman"/>
+          <w:sz w:val="24"/>
+        </w:rPr>
+        <w:t xml:space="preserve">, thing:1750025; bagian 3/3 </w:t>
+      </w:r>
+      <w:r>
+        <w:rPr>
+          <w:rFonts w:ascii="Times New Roman" w:hAnsi="Times New Roman" w:cs="Times New Roman" w:eastAsia="Times New Roman"/>
+          <w:i/>
+          <w:sz w:val="24"/>
+        </w:rPr>
+        <w:t>arm</w:t>
+      </w:r>
+      <w:r>
+        <w:rPr>
+          <w:rFonts w:ascii="Times New Roman" w:hAnsi="Times New Roman" w:cs="Times New Roman" w:eastAsia="Times New Roman"/>
+          <w:sz w:val="24"/>
+        </w:rPr>
+        <w:t>, thing:1838120), Thingiverse, 2016. Lisensi CC BY-NC 4.0. [Daring]. Tersedia: https://www.thingiverse.com/thing:1838120</w:t>
       </w:r>
     </w:p>
     <w:p>
@@ -7015,7 +7019,7 @@
         </w:trPr>
         <w:tc>
           <w:tcPr>
-            <w:tcW w:type="dxa" w:w="570"/>
+            <w:tcW w:type="dxa" w:w="568"/>
             <w:tcBorders>
               <w:bottom w:val="single" w:sz="6" w:space="0" w:color="000000"/>
             </w:tcBorders>
@@ -7044,7 +7048,7 @@
         </w:tc>
         <w:tc>
           <w:tcPr>
-            <w:tcW w:type="dxa" w:w="1289"/>
+            <w:tcW w:type="dxa" w:w="1286"/>
             <w:tcBorders>
               <w:bottom w:val="single" w:sz="6" w:space="0" w:color="000000"/>
             </w:tcBorders>
@@ -7073,7 +7077,7 @@
         </w:tc>
         <w:tc>
           <w:tcPr>
-            <w:tcW w:type="dxa" w:w="957"/>
+            <w:tcW w:type="dxa" w:w="956"/>
             <w:tcBorders>
               <w:bottom w:val="single" w:sz="6" w:space="0" w:color="000000"/>
             </w:tcBorders>
@@ -7102,7 +7106,7 @@
         </w:tc>
         <w:tc>
           <w:tcPr>
-            <w:tcW w:type="dxa" w:w="6209"/>
+            <w:tcW w:type="dxa" w:w="6216"/>
             <w:tcBorders>
               <w:bottom w:val="single" w:sz="6" w:space="0" w:color="000000"/>
             </w:tcBorders>
@@ -7136,7 +7140,7 @@
         </w:trPr>
         <w:tc>
           <w:tcPr>
-            <w:tcW w:type="dxa" w:w="570"/>
+            <w:tcW w:type="dxa" w:w="568"/>
           </w:tcPr>
           <w:p>
             <w:pPr>
@@ -7157,7 +7161,7 @@
         </w:tc>
         <w:tc>
           <w:tcPr>
-            <w:tcW w:type="dxa" w:w="1289"/>
+            <w:tcW w:type="dxa" w:w="1286"/>
           </w:tcPr>
           <w:p>
             <w:pPr>
@@ -7179,7 +7183,7 @@
         </w:tc>
         <w:tc>
           <w:tcPr>
-            <w:tcW w:type="dxa" w:w="957"/>
+            <w:tcW w:type="dxa" w:w="956"/>
           </w:tcPr>
           <w:p>
             <w:pPr>
@@ -7200,7 +7204,7 @@
         </w:tc>
         <w:tc>
           <w:tcPr>
-            <w:tcW w:type="dxa" w:w="6209"/>
+            <w:tcW w:type="dxa" w:w="6216"/>
           </w:tcPr>
           <w:p>
             <w:pPr>
@@ -7301,7 +7305,7 @@
         </w:trPr>
         <w:tc>
           <w:tcPr>
-            <w:tcW w:type="dxa" w:w="570"/>
+            <w:tcW w:type="dxa" w:w="568"/>
           </w:tcPr>
           <w:p>
             <w:pPr>
@@ -7322,7 +7326,7 @@
         </w:tc>
         <w:tc>
           <w:tcPr>
-            <w:tcW w:type="dxa" w:w="1289"/>
+            <w:tcW w:type="dxa" w:w="1286"/>
           </w:tcPr>
           <w:p>
             <w:pPr>
@@ -7344,7 +7348,7 @@
         </w:tc>
         <w:tc>
           <w:tcPr>
-            <w:tcW w:type="dxa" w:w="957"/>
+            <w:tcW w:type="dxa" w:w="956"/>
           </w:tcPr>
           <w:p>
             <w:pPr>
@@ -7365,22 +7369,22 @@
         </w:tc>
         <w:tc>
           <w:tcPr>
-            <w:tcW w:type="dxa" w:w="6209"/>
-          </w:tcPr>
-          <w:p>
-            <w:pPr>
-              <w:keepNext w:val="0"/>
-              <w:widowControl/>
-              <w:spacing w:before="0" w:after="0" w:line="240" w:lineRule="auto"/>
-              <w:jc w:val="left"/>
-            </w:pPr>
-            <w:r/>
-            <w:r>
-              <w:rPr>
-                <w:rFonts w:ascii="Times New Roman" w:hAnsi="Times New Roman" w:cs="Times New Roman" w:eastAsia="Times New Roman"/>
-                <w:sz w:val="20"/>
-              </w:rPr>
-              <w:t>• Merancang dan memodifikasi struktur mekanik cetak 3D lengan robot 5-DOF (adaptasi desain rujukan Wonder Tiger).</w:t>
+            <w:tcW w:type="dxa" w:w="6216"/>
+          </w:tcPr>
+          <w:p>
+            <w:pPr>
+              <w:keepNext w:val="0"/>
+              <w:widowControl/>
+              <w:spacing w:before="0" w:after="0" w:line="240" w:lineRule="auto"/>
+              <w:jc w:val="left"/>
+            </w:pPr>
+            <w:r/>
+            <w:r>
+              <w:rPr>
+                <w:rFonts w:ascii="Times New Roman" w:hAnsi="Times New Roman" w:cs="Times New Roman" w:eastAsia="Times New Roman"/>
+                <w:sz w:val="20"/>
+              </w:rPr>
+              <w:t>• Merancang dan memodifikasi struktur mekanik cetak 3D lengan robot 5-DOF (adaptasi desain rujukan LimpSquid "Robotic arm" [11] — proyek Wonder Tiger).</w:t>
             </w:r>
             <w:r>
               <w:br/>
@@ -7436,7 +7440,7 @@
         </w:trPr>
         <w:tc>
           <w:tcPr>
-            <w:tcW w:type="dxa" w:w="570"/>
+            <w:tcW w:type="dxa" w:w="568"/>
           </w:tcPr>
           <w:p>
             <w:pPr>
@@ -7457,7 +7461,7 @@
         </w:tc>
         <w:tc>
           <w:tcPr>
-            <w:tcW w:type="dxa" w:w="1289"/>
+            <w:tcW w:type="dxa" w:w="1286"/>
           </w:tcPr>
           <w:p>
             <w:pPr>
@@ -7479,7 +7483,7 @@
         </w:tc>
         <w:tc>
           <w:tcPr>
-            <w:tcW w:type="dxa" w:w="957"/>
+            <w:tcW w:type="dxa" w:w="956"/>
           </w:tcPr>
           <w:p>
             <w:pPr>
@@ -7500,7 +7504,7 @@
         </w:tc>
         <w:tc>
           <w:tcPr>
-            <w:tcW w:type="dxa" w:w="6209"/>
+            <w:tcW w:type="dxa" w:w="6216"/>
           </w:tcPr>
           <w:p>
             <w:pPr>
@@ -10101,7 +10105,7 @@
         </w:trPr>
         <w:tc>
           <w:tcPr>
-            <w:tcW w:type="dxa" w:w="1966"/>
+            <w:tcW w:type="dxa" w:w="1964"/>
             <w:tcBorders>
               <w:bottom w:val="single" w:sz="6" w:space="0" w:color="000000"/>
             </w:tcBorders>
@@ -10130,7 +10134,7 @@
         </w:tc>
         <w:tc>
           <w:tcPr>
-            <w:tcW w:type="dxa" w:w="3250"/>
+            <w:tcW w:type="dxa" w:w="3270"/>
             <w:tcBorders>
               <w:bottom w:val="single" w:sz="6" w:space="0" w:color="000000"/>
             </w:tcBorders>
@@ -10159,7 +10163,7 @@
         </w:tc>
         <w:tc>
           <w:tcPr>
-            <w:tcW w:type="dxa" w:w="3810"/>
+            <w:tcW w:type="dxa" w:w="3791"/>
             <w:tcBorders>
               <w:bottom w:val="single" w:sz="6" w:space="0" w:color="000000"/>
             </w:tcBorders>
@@ -10193,7 +10197,7 @@
         </w:trPr>
         <w:tc>
           <w:tcPr>
-            <w:tcW w:type="dxa" w:w="1966"/>
+            <w:tcW w:type="dxa" w:w="1964"/>
           </w:tcPr>
           <w:p>
             <w:pPr>
@@ -10215,22 +10219,22 @@
         </w:tc>
         <w:tc>
           <w:tcPr>
-            <w:tcW w:type="dxa" w:w="3250"/>
-          </w:tcPr>
-          <w:p>
-            <w:pPr>
-              <w:keepNext w:val="0"/>
-              <w:widowControl/>
-              <w:spacing w:before="0" w:after="0" w:line="240" w:lineRule="auto"/>
-              <w:jc w:val="left"/>
-            </w:pPr>
-            <w:r/>
-            <w:r>
-              <w:rPr>
-                <w:rFonts w:ascii="Times New Roman" w:hAnsi="Times New Roman" w:cs="Times New Roman" w:eastAsia="Times New Roman"/>
-                <w:sz w:val="20"/>
-              </w:rPr>
-              <w:t>Adaptasi desain rujukan Wonder Tiger (lisensi CC BY-NC 4.0), 5 derajat kebebasan (</w:t>
+            <w:tcW w:type="dxa" w:w="3270"/>
+          </w:tcPr>
+          <w:p>
+            <w:pPr>
+              <w:keepNext w:val="0"/>
+              <w:widowControl/>
+              <w:spacing w:before="0" w:after="0" w:line="240" w:lineRule="auto"/>
+              <w:jc w:val="left"/>
+            </w:pPr>
+            <w:r/>
+            <w:r>
+              <w:rPr>
+                <w:rFonts w:ascii="Times New Roman" w:hAnsi="Times New Roman" w:cs="Times New Roman" w:eastAsia="Times New Roman"/>
+                <w:sz w:val="20"/>
+              </w:rPr>
+              <w:t>Adaptasi desain rujukan LimpSquid "Robotic arm" (proyek Wonder Tiger; lisensi CC BY-NC 4.0) [11], 5 derajat kebebasan (</w:t>
             </w:r>
             <w:r>
               <w:rPr>
@@ -10251,7 +10255,7 @@
         </w:tc>
         <w:tc>
           <w:tcPr>
-            <w:tcW w:type="dxa" w:w="3810"/>
+            <w:tcW w:type="dxa" w:w="3791"/>
           </w:tcPr>
           <w:p>
             <w:pPr>
@@ -10292,7 +10296,7 @@
         </w:trPr>
         <w:tc>
           <w:tcPr>
-            <w:tcW w:type="dxa" w:w="1966"/>
+            <w:tcW w:type="dxa" w:w="1964"/>
           </w:tcPr>
           <w:p>
             <w:pPr>
@@ -10314,7 +10318,7 @@
         </w:tc>
         <w:tc>
           <w:tcPr>
-            <w:tcW w:type="dxa" w:w="3250"/>
+            <w:tcW w:type="dxa" w:w="3270"/>
           </w:tcPr>
           <w:p>
             <w:pPr>
@@ -10350,7 +10354,7 @@
         </w:tc>
         <w:tc>
           <w:tcPr>
-            <w:tcW w:type="dxa" w:w="3810"/>
+            <w:tcW w:type="dxa" w:w="3791"/>
           </w:tcPr>
           <w:p>
             <w:pPr>
@@ -10376,7 +10380,7 @@
         </w:trPr>
         <w:tc>
           <w:tcPr>
-            <w:tcW w:type="dxa" w:w="1966"/>
+            <w:tcW w:type="dxa" w:w="1964"/>
           </w:tcPr>
           <w:p>
             <w:pPr>
@@ -10398,7 +10402,7 @@
         </w:tc>
         <w:tc>
           <w:tcPr>
-            <w:tcW w:type="dxa" w:w="3250"/>
+            <w:tcW w:type="dxa" w:w="3270"/>
           </w:tcPr>
           <w:p>
             <w:pPr>
@@ -10433,7 +10437,7 @@
         </w:tc>
         <w:tc>
           <w:tcPr>
-            <w:tcW w:type="dxa" w:w="3810"/>
+            <w:tcW w:type="dxa" w:w="3791"/>
           </w:tcPr>
           <w:p>
             <w:pPr>
@@ -10459,7 +10463,7 @@
         </w:trPr>
         <w:tc>
           <w:tcPr>
-            <w:tcW w:type="dxa" w:w="1966"/>
+            <w:tcW w:type="dxa" w:w="1964"/>
           </w:tcPr>
           <w:p>
             <w:pPr>
@@ -10481,7 +10485,7 @@
         </w:tc>
         <w:tc>
           <w:tcPr>
-            <w:tcW w:type="dxa" w:w="3250"/>
+            <w:tcW w:type="dxa" w:w="3270"/>
           </w:tcPr>
           <w:p>
             <w:pPr>
@@ -10562,7 +10566,7 @@
         </w:tc>
         <w:tc>
           <w:tcPr>
-            <w:tcW w:type="dxa" w:w="3810"/>
+            <w:tcW w:type="dxa" w:w="3791"/>
           </w:tcPr>
           <w:p>
             <w:pPr>
@@ -10588,7 +10592,7 @@
         </w:trPr>
         <w:tc>
           <w:tcPr>
-            <w:tcW w:type="dxa" w:w="1966"/>
+            <w:tcW w:type="dxa" w:w="1964"/>
           </w:tcPr>
           <w:p>
             <w:pPr>
@@ -10610,7 +10614,7 @@
         </w:tc>
         <w:tc>
           <w:tcPr>
-            <w:tcW w:type="dxa" w:w="3250"/>
+            <w:tcW w:type="dxa" w:w="3270"/>
           </w:tcPr>
           <w:p>
             <w:pPr>
@@ -10631,7 +10635,7 @@
         </w:tc>
         <w:tc>
           <w:tcPr>
-            <w:tcW w:type="dxa" w:w="3810"/>
+            <w:tcW w:type="dxa" w:w="3791"/>
           </w:tcPr>
           <w:p>
             <w:pPr>
@@ -10702,7 +10706,7 @@
         </w:trPr>
         <w:tc>
           <w:tcPr>
-            <w:tcW w:type="dxa" w:w="1966"/>
+            <w:tcW w:type="dxa" w:w="1964"/>
           </w:tcPr>
           <w:p>
             <w:pPr>
@@ -10724,7 +10728,7 @@
         </w:tc>
         <w:tc>
           <w:tcPr>
-            <w:tcW w:type="dxa" w:w="3250"/>
+            <w:tcW w:type="dxa" w:w="3270"/>
           </w:tcPr>
           <w:p>
             <w:pPr>
@@ -10760,7 +10764,7 @@
         </w:tc>
         <w:tc>
           <w:tcPr>
-            <w:tcW w:type="dxa" w:w="3810"/>
+            <w:tcW w:type="dxa" w:w="3791"/>
           </w:tcPr>
           <w:p>
             <w:pPr>
@@ -10816,7 +10820,7 @@
         </w:trPr>
         <w:tc>
           <w:tcPr>
-            <w:tcW w:type="dxa" w:w="1966"/>
+            <w:tcW w:type="dxa" w:w="1964"/>
           </w:tcPr>
           <w:p>
             <w:pPr>
@@ -10838,7 +10842,7 @@
         </w:tc>
         <w:tc>
           <w:tcPr>
-            <w:tcW w:type="dxa" w:w="3250"/>
+            <w:tcW w:type="dxa" w:w="3270"/>
           </w:tcPr>
           <w:p>
             <w:pPr>
@@ -10859,7 +10863,7 @@
         </w:tc>
         <w:tc>
           <w:tcPr>
-            <w:tcW w:type="dxa" w:w="3810"/>
+            <w:tcW w:type="dxa" w:w="3791"/>
           </w:tcPr>
           <w:p>
             <w:pPr>
@@ -10915,7 +10919,7 @@
         </w:trPr>
         <w:tc>
           <w:tcPr>
-            <w:tcW w:type="dxa" w:w="1966"/>
+            <w:tcW w:type="dxa" w:w="1964"/>
           </w:tcPr>
           <w:p>
             <w:pPr>
@@ -10937,7 +10941,7 @@
         </w:tc>
         <w:tc>
           <w:tcPr>
-            <w:tcW w:type="dxa" w:w="3250"/>
+            <w:tcW w:type="dxa" w:w="3270"/>
           </w:tcPr>
           <w:p>
             <w:pPr>
@@ -10988,7 +10992,7 @@
         </w:tc>
         <w:tc>
           <w:tcPr>
-            <w:tcW w:type="dxa" w:w="3810"/>
+            <w:tcW w:type="dxa" w:w="3791"/>
           </w:tcPr>
           <w:p>
             <w:pPr>
@@ -11029,7 +11033,7 @@
         </w:trPr>
         <w:tc>
           <w:tcPr>
-            <w:tcW w:type="dxa" w:w="1966"/>
+            <w:tcW w:type="dxa" w:w="1964"/>
           </w:tcPr>
           <w:p>
             <w:pPr>
@@ -11051,7 +11055,7 @@
         </w:tc>
         <w:tc>
           <w:tcPr>
-            <w:tcW w:type="dxa" w:w="3250"/>
+            <w:tcW w:type="dxa" w:w="3270"/>
           </w:tcPr>
           <w:p>
             <w:pPr>
@@ -11072,7 +11076,7 @@
         </w:tc>
         <w:tc>
           <w:tcPr>
-            <w:tcW w:type="dxa" w:w="3810"/>
+            <w:tcW w:type="dxa" w:w="3791"/>
           </w:tcPr>
           <w:p>
             <w:pPr>

</xml_diff>